<commit_message>
Include default system credentials table in relatorio_mudancas_hoje.docx
</commit_message>
<xml_diff>
--- a/app_webgis/relatorio_mudancas_hoje.docx
+++ b/app_webgis/relatorio_mudancas_hoje.docx
@@ -151,6 +151,468 @@
       <w:r>
         <w:t>Resolução de restrição no PostgreSQL referente ao campo de senha legada e gravação simultânea de hash de senha.</w:t>
       </w:r>
+    </w:p>
+    <w:p>
+      <w:pPr>
+        <w:spacing w:after="240"/>
+      </w:pPr>
+    </w:p>
+    <w:p>
+      <w:pPr>
+        <w:pStyle w:val="Heading1"/>
+      </w:pPr>
+      <w:r>
+        <w:rPr>
+          <w:color w:val="1B365D"/>
+        </w:rPr>
+        <w:t>2. Credenciais de Acesso Padrão (Usuários e Senhas)</w:t>
+      </w:r>
+    </w:p>
+    <w:p>
+      <w:pPr>
+        <w:spacing w:line="276" w:lineRule="auto" w:after="160"/>
+      </w:pPr>
+      <w:r>
+        <w:t>Para a realização de testes, validações por bancas examinadoras e demonstrações operacionais, o sistema possui as seguintes contas institucionais pré-configuradas:</w:t>
+      </w:r>
+    </w:p>
+    <w:tbl>
+      <w:tblPr>
+        <w:tblW w:type="auto" w:w="0"/>
+        <w:jc w:val="center"/>
+        <w:tblLook w:firstColumn="1" w:firstRow="1" w:lastColumn="0" w:lastRow="0" w:noHBand="0" w:noVBand="1" w:val="04A0"/>
+      </w:tblPr>
+      <w:tblGrid>
+        <w:gridCol w:w="1872"/>
+        <w:gridCol w:w="1872"/>
+        <w:gridCol w:w="1872"/>
+        <w:gridCol w:w="1872"/>
+        <w:gridCol w:w="1872"/>
+      </w:tblGrid>
+      <w:tr>
+        <w:tc>
+          <w:tcPr>
+            <w:tcW w:type="dxa" w:w="1872"/>
+            <w:shd w:fill="1B365D"/>
+          </w:tcPr>
+          <w:p>
+            <w:r>
+              <w:rPr>
+                <w:b/>
+                <w:color w:val="FFFFFF"/>
+              </w:rPr>
+              <w:t>Perfil / Esfera</w:t>
+            </w:r>
+          </w:p>
+        </w:tc>
+        <w:tc>
+          <w:tcPr>
+            <w:tcW w:type="dxa" w:w="1872"/>
+            <w:shd w:fill="1B365D"/>
+          </w:tcPr>
+          <w:p>
+            <w:r>
+              <w:rPr>
+                <w:b/>
+                <w:color w:val="FFFFFF"/>
+              </w:rPr>
+              <w:t>Nome de Usuário</w:t>
+            </w:r>
+          </w:p>
+        </w:tc>
+        <w:tc>
+          <w:tcPr>
+            <w:tcW w:type="dxa" w:w="1872"/>
+            <w:shd w:fill="1B365D"/>
+          </w:tcPr>
+          <w:p>
+            <w:r>
+              <w:rPr>
+                <w:b/>
+                <w:color w:val="FFFFFF"/>
+              </w:rPr>
+              <w:t>E-mail de Login</w:t>
+            </w:r>
+          </w:p>
+        </w:tc>
+        <w:tc>
+          <w:tcPr>
+            <w:tcW w:type="dxa" w:w="1872"/>
+            <w:shd w:fill="1B365D"/>
+          </w:tcPr>
+          <w:p>
+            <w:r>
+              <w:rPr>
+                <w:b/>
+                <w:color w:val="FFFFFF"/>
+              </w:rPr>
+              <w:t>Senha Inicial</w:t>
+            </w:r>
+          </w:p>
+        </w:tc>
+        <w:tc>
+          <w:tcPr>
+            <w:tcW w:type="dxa" w:w="1872"/>
+            <w:shd w:fill="1B365D"/>
+          </w:tcPr>
+          <w:p>
+            <w:r>
+              <w:rPr>
+                <w:b/>
+                <w:color w:val="FFFFFF"/>
+              </w:rPr>
+              <w:t>Função / Escopo</w:t>
+            </w:r>
+          </w:p>
+        </w:tc>
+      </w:tr>
+      <w:tr>
+        <w:tc>
+          <w:tcPr>
+            <w:tcW w:type="dxa" w:w="1872"/>
+            <w:shd w:fill="F0F4F8"/>
+          </w:tcPr>
+          <w:p>
+            <w:r>
+              <w:t>Administrador Geral</w:t>
+            </w:r>
+          </w:p>
+        </w:tc>
+        <w:tc>
+          <w:tcPr>
+            <w:tcW w:type="dxa" w:w="1872"/>
+            <w:shd w:fill="F0F4F8"/>
+          </w:tcPr>
+          <w:p>
+            <w:r>
+              <w:t>admin</w:t>
+            </w:r>
+          </w:p>
+        </w:tc>
+        <w:tc>
+          <w:tcPr>
+            <w:tcW w:type="dxa" w:w="1872"/>
+            <w:shd w:fill="F0F4F8"/>
+          </w:tcPr>
+          <w:p>
+            <w:r>
+              <w:t>admin.geral@geoportal.gov.br</w:t>
+            </w:r>
+          </w:p>
+        </w:tc>
+        <w:tc>
+          <w:tcPr>
+            <w:tcW w:type="dxa" w:w="1872"/>
+            <w:shd w:fill="F0F4F8"/>
+          </w:tcPr>
+          <w:p>
+            <w:r>
+              <w:t>Admin@123</w:t>
+            </w:r>
+          </w:p>
+        </w:tc>
+        <w:tc>
+          <w:tcPr>
+            <w:tcW w:type="dxa" w:w="1872"/>
+            <w:shd w:fill="F0F4F8"/>
+          </w:tcPr>
+          <w:p>
+            <w:r>
+              <w:t>Gestão global de todas as esferas e dados.</w:t>
+            </w:r>
+          </w:p>
+        </w:tc>
+      </w:tr>
+      <w:tr>
+        <w:tc>
+          <w:tcPr>
+            <w:tcW w:type="dxa" w:w="1872"/>
+            <w:shd w:fill="FFFFFF"/>
+          </w:tcPr>
+          <w:p>
+            <w:r>
+              <w:t>Gestor Nacional</w:t>
+            </w:r>
+          </w:p>
+        </w:tc>
+        <w:tc>
+          <w:tcPr>
+            <w:tcW w:type="dxa" w:w="1872"/>
+            <w:shd w:fill="FFFFFF"/>
+          </w:tcPr>
+          <w:p>
+            <w:r>
+              <w:t>defesa_nacional</w:t>
+            </w:r>
+          </w:p>
+        </w:tc>
+        <w:tc>
+          <w:tcPr>
+            <w:tcW w:type="dxa" w:w="1872"/>
+            <w:shd w:fill="FFFFFF"/>
+          </w:tcPr>
+          <w:p>
+            <w:r>
+              <w:t>nacional@defesacivil.gov.br</w:t>
+            </w:r>
+          </w:p>
+        </w:tc>
+        <w:tc>
+          <w:tcPr>
+            <w:tcW w:type="dxa" w:w="1872"/>
+            <w:shd w:fill="FFFFFF"/>
+          </w:tcPr>
+          <w:p>
+            <w:r>
+              <w:t>Defesa@123</w:t>
+            </w:r>
+          </w:p>
+        </w:tc>
+        <w:tc>
+          <w:tcPr>
+            <w:tcW w:type="dxa" w:w="1872"/>
+            <w:shd w:fill="FFFFFF"/>
+          </w:tcPr>
+          <w:p>
+            <w:r>
+              <w:t>Gestão e cadastro de agentes na esfera Nacional.</w:t>
+            </w:r>
+          </w:p>
+        </w:tc>
+      </w:tr>
+      <w:tr>
+        <w:tc>
+          <w:tcPr>
+            <w:tcW w:type="dxa" w:w="1872"/>
+            <w:shd w:fill="F0F4F8"/>
+          </w:tcPr>
+          <w:p>
+            <w:r>
+              <w:t>Gestor Estadual</w:t>
+            </w:r>
+          </w:p>
+        </w:tc>
+        <w:tc>
+          <w:tcPr>
+            <w:tcW w:type="dxa" w:w="1872"/>
+            <w:shd w:fill="F0F4F8"/>
+          </w:tcPr>
+          <w:p>
+            <w:r>
+              <w:t>defesa_estadual</w:t>
+            </w:r>
+          </w:p>
+        </w:tc>
+        <w:tc>
+          <w:tcPr>
+            <w:tcW w:type="dxa" w:w="1872"/>
+            <w:shd w:fill="F0F4F8"/>
+          </w:tcPr>
+          <w:p>
+            <w:r>
+              <w:t>estadual@defesacivil.rj.gov.br</w:t>
+            </w:r>
+          </w:p>
+        </w:tc>
+        <w:tc>
+          <w:tcPr>
+            <w:tcW w:type="dxa" w:w="1872"/>
+            <w:shd w:fill="F0F4F8"/>
+          </w:tcPr>
+          <w:p>
+            <w:r>
+              <w:t>Defesa@123</w:t>
+            </w:r>
+          </w:p>
+        </w:tc>
+        <w:tc>
+          <w:tcPr>
+            <w:tcW w:type="dxa" w:w="1872"/>
+            <w:shd w:fill="F0F4F8"/>
+          </w:tcPr>
+          <w:p>
+            <w:r>
+              <w:t>Gestão e cadastro de agentes na esfera Estadual RJ.</w:t>
+            </w:r>
+          </w:p>
+        </w:tc>
+      </w:tr>
+      <w:tr>
+        <w:tc>
+          <w:tcPr>
+            <w:tcW w:type="dxa" w:w="1872"/>
+            <w:shd w:fill="FFFFFF"/>
+          </w:tcPr>
+          <w:p>
+            <w:r>
+              <w:t>Gestor Municipal</w:t>
+            </w:r>
+          </w:p>
+        </w:tc>
+        <w:tc>
+          <w:tcPr>
+            <w:tcW w:type="dxa" w:w="1872"/>
+            <w:shd w:fill="FFFFFF"/>
+          </w:tcPr>
+          <w:p>
+            <w:r>
+              <w:t>defesa_municipal</w:t>
+            </w:r>
+          </w:p>
+        </w:tc>
+        <w:tc>
+          <w:tcPr>
+            <w:tcW w:type="dxa" w:w="1872"/>
+            <w:shd w:fill="FFFFFF"/>
+          </w:tcPr>
+          <w:p>
+            <w:r>
+              <w:t>defesacivil@angra.rj.gov.br</w:t>
+            </w:r>
+          </w:p>
+        </w:tc>
+        <w:tc>
+          <w:tcPr>
+            <w:tcW w:type="dxa" w:w="1872"/>
+            <w:shd w:fill="FFFFFF"/>
+          </w:tcPr>
+          <w:p>
+            <w:r>
+              <w:t>Defesa@123</w:t>
+            </w:r>
+          </w:p>
+        </w:tc>
+        <w:tc>
+          <w:tcPr>
+            <w:tcW w:type="dxa" w:w="1872"/>
+            <w:shd w:fill="FFFFFF"/>
+          </w:tcPr>
+          <w:p>
+            <w:r>
+              <w:t>Gestão e cadastro de agentes na esfera Municipal.</w:t>
+            </w:r>
+          </w:p>
+        </w:tc>
+      </w:tr>
+      <w:tr>
+        <w:tc>
+          <w:tcPr>
+            <w:tcW w:type="dxa" w:w="1872"/>
+            <w:shd w:fill="F0F4F8"/>
+          </w:tcPr>
+          <w:p>
+            <w:r>
+              <w:t>Organização Parceira</w:t>
+            </w:r>
+          </w:p>
+        </w:tc>
+        <w:tc>
+          <w:tcPr>
+            <w:tcW w:type="dxa" w:w="1872"/>
+            <w:shd w:fill="F0F4F8"/>
+          </w:tcPr>
+          <w:p>
+            <w:r>
+              <w:t>org</w:t>
+            </w:r>
+          </w:p>
+        </w:tc>
+        <w:tc>
+          <w:tcPr>
+            <w:tcW w:type="dxa" w:w="1872"/>
+            <w:shd w:fill="F0F4F8"/>
+          </w:tcPr>
+          <w:p>
+            <w:r>
+              <w:t>contato@orgamb.org.br</w:t>
+            </w:r>
+          </w:p>
+        </w:tc>
+        <w:tc>
+          <w:tcPr>
+            <w:tcW w:type="dxa" w:w="1872"/>
+            <w:shd w:fill="F0F4F8"/>
+          </w:tcPr>
+          <w:p>
+            <w:r>
+              <w:t>Org@123</w:t>
+            </w:r>
+          </w:p>
+        </w:tc>
+        <w:tc>
+          <w:tcPr>
+            <w:tcW w:type="dxa" w:w="1872"/>
+            <w:shd w:fill="F0F4F8"/>
+          </w:tcPr>
+          <w:p>
+            <w:r>
+              <w:t>Gestão técnica de relatórios e dados da ONG.</w:t>
+            </w:r>
+          </w:p>
+        </w:tc>
+      </w:tr>
+      <w:tr>
+        <w:tc>
+          <w:tcPr>
+            <w:tcW w:type="dxa" w:w="1872"/>
+            <w:shd w:fill="FFFFFF"/>
+          </w:tcPr>
+          <w:p>
+            <w:r>
+              <w:t>Agente de Campo</w:t>
+            </w:r>
+          </w:p>
+        </w:tc>
+        <w:tc>
+          <w:tcPr>
+            <w:tcW w:type="dxa" w:w="1872"/>
+            <w:shd w:fill="FFFFFF"/>
+          </w:tcPr>
+          <w:p>
+            <w:r>
+              <w:t>user</w:t>
+            </w:r>
+          </w:p>
+        </w:tc>
+        <w:tc>
+          <w:tcPr>
+            <w:tcW w:type="dxa" w:w="1872"/>
+            <w:shd w:fill="FFFFFF"/>
+          </w:tcPr>
+          <w:p>
+            <w:r>
+              <w:t>usuario@email.com</w:t>
+            </w:r>
+          </w:p>
+        </w:tc>
+        <w:tc>
+          <w:tcPr>
+            <w:tcW w:type="dxa" w:w="1872"/>
+            <w:shd w:fill="FFFFFF"/>
+          </w:tcPr>
+          <w:p>
+            <w:r>
+              <w:t>User@123</w:t>
+            </w:r>
+          </w:p>
+        </w:tc>
+        <w:tc>
+          <w:tcPr>
+            <w:tcW w:type="dxa" w:w="1872"/>
+            <w:shd w:fill="FFFFFF"/>
+          </w:tcPr>
+          <w:p>
+            <w:r>
+              <w:t>Coleta de campo (1-ponto/Shape/CSV) e edição de pontos próprios.</w:t>
+            </w:r>
+          </w:p>
+        </w:tc>
+      </w:tr>
+    </w:tbl>
+    <w:p>
+      <w:pPr>
+        <w:spacing w:after="240"/>
+      </w:pPr>
     </w:p>
     <w:sectPr>
       <w:pgSz w:w="12240" w:h="15840"/>

</xml_diff>